<commit_message>
java 6 added nio to server
</commit_message>
<xml_diff>
--- a/db/Lab4/Lab4.docx
+++ b/db/Lab4/Lab4.docx
@@ -820,6 +820,7 @@
       </w:pPr>
       <w:bookmarkStart w:id="0" w:name="_Toc225336084"/>
       <w:r>
+        <w:lastRenderedPageBreak/>
         <w:t>Задание</w:t>
       </w:r>
       <w:bookmarkEnd w:id="0"/>
@@ -934,7 +935,6 @@
       </w:pPr>
       <w:bookmarkStart w:id="1" w:name="_Toc225336085"/>
       <w:r>
-        <w:lastRenderedPageBreak/>
         <w:t>Реализация запросов</w:t>
       </w:r>
       <w:bookmarkEnd w:id="1"/>
@@ -1000,33 +1000,79 @@
       <w:pPr>
         <w:pStyle w:val="af"/>
         <w:ind w:firstLine="360"/>
+        <w:rPr>
+          <w:lang w:val="ru-RU"/>
+        </w:rPr>
       </w:pPr>
       <w:r>
         <w:rPr>
           <w:color w:val="0000FF"/>
         </w:rPr>
-        <w:t>right join</w:t>
-      </w:r>
-      <w:r>
-        <w:t xml:space="preserve"> Н_ВЕДОМОСТИ v </w:t>
+        <w:t>right</w:t>
       </w:r>
       <w:r>
         <w:rPr>
           <w:color w:val="0000FF"/>
+          <w:lang w:val="ru-RU"/>
+        </w:rPr>
+        <w:t xml:space="preserve"> </w:t>
+      </w:r>
+      <w:r>
+        <w:rPr>
+          <w:color w:val="0000FF"/>
+        </w:rPr>
+        <w:t>join</w:t>
+      </w:r>
+      <w:r>
+        <w:rPr>
+          <w:lang w:val="ru-RU"/>
+        </w:rPr>
+        <w:t xml:space="preserve"> Н_ВЕДОМОСТИ </w:t>
+      </w:r>
+      <w:r>
+        <w:t>v</w:t>
+      </w:r>
+      <w:r>
+        <w:rPr>
+          <w:lang w:val="ru-RU"/>
+        </w:rPr>
+        <w:t xml:space="preserve"> </w:t>
+      </w:r>
+      <w:r>
+        <w:rPr>
+          <w:color w:val="0000FF"/>
         </w:rPr>
         <w:t>on</w:t>
       </w:r>
       <w:r>
-        <w:t xml:space="preserve"> v.ВЕД_ИД = t.ИД</w:t>
+        <w:rPr>
+          <w:lang w:val="ru-RU"/>
+        </w:rPr>
+        <w:t xml:space="preserve"> </w:t>
+      </w:r>
+      <w:r>
+        <w:t>v</w:t>
+      </w:r>
+      <w:r>
+        <w:rPr>
+          <w:lang w:val="ru-RU"/>
+        </w:rPr>
+        <w:t xml:space="preserve">.ВЕД_ИД = </w:t>
+      </w:r>
+      <w:r>
+        <w:t>t</w:t>
+      </w:r>
+      <w:r>
+        <w:rPr>
+          <w:lang w:val="ru-RU"/>
+        </w:rPr>
+        <w:t>.ИД</w:t>
       </w:r>
     </w:p>
     <w:p>
       <w:pPr>
         <w:pStyle w:val="24"/>
         <w:ind w:firstLine="360"/>
-        <w:rPr>
-          <w:lang w:val="ru-RU"/>
-        </w:rPr>
       </w:pPr>
       <w:r>
         <w:rPr>
@@ -1035,7 +1081,15 @@
         <w:t>where</w:t>
       </w:r>
       <w:r>
-        <w:t xml:space="preserve"> v.ИД &gt; </w:t>
+        <w:t xml:space="preserve"> </w:t>
+      </w:r>
+      <w:proofErr w:type="spellStart"/>
+      <w:r>
+        <w:t>v.ИД</w:t>
+      </w:r>
+      <w:proofErr w:type="spellEnd"/>
+      <w:r>
+        <w:t xml:space="preserve"> &gt; </w:t>
       </w:r>
       <w:r>
         <w:rPr>
@@ -1053,7 +1107,15 @@
         <w:t>and</w:t>
       </w:r>
       <w:r>
-        <w:t xml:space="preserve"> v.ДАТА = </w:t>
+        <w:t xml:space="preserve"> </w:t>
+      </w:r>
+      <w:proofErr w:type="spellStart"/>
+      <w:r>
+        <w:t>v.ДАТА</w:t>
+      </w:r>
+      <w:proofErr w:type="spellEnd"/>
+      <w:r>
+        <w:t xml:space="preserve"> = </w:t>
       </w:r>
       <w:r>
         <w:rPr>
@@ -1070,6 +1132,9 @@
         <w:ind w:firstLine="360"/>
       </w:pPr>
       <w:r>
+        <w:rPr>
+          <w:noProof/>
+        </w:rPr>
         <w:drawing>
           <wp:inline distT="0" distB="0" distL="0" distR="0" wp14:anchorId="2436ECDF" wp14:editId="278EA8E9">
             <wp:extent cx="5940425" cy="3115310"/>
@@ -1114,6 +1179,9 @@
           <w:ilvl w:val="0"/>
           <w:numId w:val="13"/>
         </w:numPr>
+        <w:rPr>
+          <w:lang w:val="ru-RU"/>
+        </w:rPr>
       </w:pPr>
       <w:r>
         <w:rPr>
@@ -1122,6 +1190,9 @@
         <w:t>select</w:t>
       </w:r>
       <w:r>
+        <w:rPr>
+          <w:lang w:val="ru-RU"/>
+        </w:rPr>
         <w:t xml:space="preserve"> Н_ЛЮДИ.ИМЯ, Н_ВЕДОМОСТИ.ЧЛВК_ИД, Н_СЕССИЯ.УЧГОД </w:t>
       </w:r>
       <w:r>
@@ -1131,6 +1202,9 @@
         <w:t>from</w:t>
       </w:r>
       <w:r>
+        <w:rPr>
+          <w:lang w:val="ru-RU"/>
+        </w:rPr>
         <w:t xml:space="preserve"> Н_ЛЮДИ</w:t>
       </w:r>
     </w:p>
@@ -1138,14 +1212,33 @@
       <w:pPr>
         <w:pStyle w:val="af"/>
         <w:ind w:firstLine="360"/>
+        <w:rPr>
+          <w:lang w:val="ru-RU"/>
+        </w:rPr>
       </w:pPr>
       <w:r>
         <w:rPr>
           <w:color w:val="0000FF"/>
         </w:rPr>
-        <w:t>right join</w:t>
-      </w:r>
-      <w:r>
+        <w:t>right</w:t>
+      </w:r>
+      <w:r>
+        <w:rPr>
+          <w:color w:val="0000FF"/>
+          <w:lang w:val="ru-RU"/>
+        </w:rPr>
+        <w:t xml:space="preserve"> </w:t>
+      </w:r>
+      <w:r>
+        <w:rPr>
+          <w:color w:val="0000FF"/>
+        </w:rPr>
+        <w:t>join</w:t>
+      </w:r>
+      <w:r>
+        <w:rPr>
+          <w:lang w:val="ru-RU"/>
+        </w:rPr>
         <w:t xml:space="preserve"> Н_ВЕДОМОСТИ </w:t>
       </w:r>
       <w:r>
@@ -1155,6 +1248,9 @@
         <w:t>on</w:t>
       </w:r>
       <w:r>
+        <w:rPr>
+          <w:lang w:val="ru-RU"/>
+        </w:rPr>
         <w:t xml:space="preserve"> Н_ВЕДОМОСТИ.ЧЛВК_ИД = Н_ЛЮДИ.ИД</w:t>
       </w:r>
     </w:p>
@@ -1162,14 +1258,33 @@
       <w:pPr>
         <w:pStyle w:val="af"/>
         <w:ind w:firstLine="360"/>
+        <w:rPr>
+          <w:lang w:val="ru-RU"/>
+        </w:rPr>
       </w:pPr>
       <w:r>
         <w:rPr>
           <w:color w:val="0000FF"/>
         </w:rPr>
-        <w:t>right join</w:t>
-      </w:r>
-      <w:r>
+        <w:t>right</w:t>
+      </w:r>
+      <w:r>
+        <w:rPr>
+          <w:color w:val="0000FF"/>
+          <w:lang w:val="ru-RU"/>
+        </w:rPr>
+        <w:t xml:space="preserve"> </w:t>
+      </w:r>
+      <w:r>
+        <w:rPr>
+          <w:color w:val="0000FF"/>
+        </w:rPr>
+        <w:t>join</w:t>
+      </w:r>
+      <w:r>
+        <w:rPr>
+          <w:lang w:val="ru-RU"/>
+        </w:rPr>
         <w:t xml:space="preserve"> Н_СЕССИЯ </w:t>
       </w:r>
       <w:r>
@@ -1179,6 +1294,9 @@
         <w:t>on</w:t>
       </w:r>
       <w:r>
+        <w:rPr>
+          <w:lang w:val="ru-RU"/>
+        </w:rPr>
         <w:t xml:space="preserve"> Н_СЕССИЯ.ЧЛВК_ИД = Н_ЛЮДИ.ИД</w:t>
       </w:r>
     </w:p>
@@ -1197,15 +1315,22 @@
         <w:t>where</w:t>
       </w:r>
       <w:r>
+        <w:rPr>
+          <w:lang w:val="ru-RU"/>
+        </w:rPr>
         <w:t xml:space="preserve"> Н_ЛЮДИ.ИД &gt; </w:t>
       </w:r>
       <w:r>
         <w:rPr>
           <w:color w:val="098658"/>
+          <w:lang w:val="ru-RU"/>
         </w:rPr>
         <w:t>152862</w:t>
       </w:r>
       <w:r>
+        <w:rPr>
+          <w:lang w:val="ru-RU"/>
+        </w:rPr>
         <w:t xml:space="preserve"> </w:t>
       </w:r>
       <w:r>
@@ -1215,15 +1340,22 @@
         <w:t>and</w:t>
       </w:r>
       <w:r>
+        <w:rPr>
+          <w:lang w:val="ru-RU"/>
+        </w:rPr>
         <w:t xml:space="preserve"> Н_ВЕДОМОСТИ.ДАТА &gt; </w:t>
       </w:r>
       <w:r>
         <w:rPr>
           <w:color w:val="A31515"/>
+          <w:lang w:val="ru-RU"/>
         </w:rPr>
         <w:t>'1998-01-05'</w:t>
       </w:r>
       <w:r>
+        <w:rPr>
+          <w:lang w:val="ru-RU"/>
+        </w:rPr>
         <w:t xml:space="preserve"> </w:t>
       </w:r>
       <w:r>
@@ -1233,15 +1365,22 @@
         <w:t>and</w:t>
       </w:r>
       <w:r>
+        <w:rPr>
+          <w:lang w:val="ru-RU"/>
+        </w:rPr>
         <w:t xml:space="preserve"> Н_СЕССИЯ.УЧГОД = </w:t>
       </w:r>
       <w:r>
         <w:rPr>
           <w:color w:val="A31515"/>
+          <w:lang w:val="ru-RU"/>
         </w:rPr>
         <w:t>'2001/2002'</w:t>
       </w:r>
       <w:r>
+        <w:rPr>
+          <w:lang w:val="ru-RU"/>
+        </w:rPr>
         <w:t>;</w:t>
       </w:r>
     </w:p>
@@ -1270,6 +1409,9 @@
         <w:ind w:firstLine="360"/>
       </w:pPr>
       <w:r>
+        <w:rPr>
+          <w:noProof/>
+        </w:rPr>
         <w:drawing>
           <wp:inline distT="0" distB="0" distL="0" distR="0" wp14:anchorId="619D5783" wp14:editId="1781E3AE">
             <wp:extent cx="5940425" cy="1278890"/>
@@ -1320,6 +1462,10 @@
         <w:ind w:firstLine="360"/>
       </w:pPr>
       <w:r>
+        <w:rPr>
+          <w:noProof/>
+        </w:rPr>
+        <w:lastRenderedPageBreak/>
         <w:drawing>
           <wp:inline distT="0" distB="0" distL="0" distR="0" wp14:anchorId="29A0D3B1" wp14:editId="16068EB3">
             <wp:extent cx="5940425" cy="1404620"/>
@@ -1360,17 +1506,11 @@
     <w:p>
       <w:pPr>
         <w:ind w:firstLine="360"/>
-        <w:rPr>
-          <w:lang w:val="en-US"/>
-        </w:rPr>
       </w:pPr>
       <w:r>
         <w:t>Изменим запрос</w:t>
       </w:r>
       <w:r>
-        <w:rPr>
-          <w:lang w:val="en-US"/>
-        </w:rPr>
         <w:t>:</w:t>
       </w:r>
     </w:p>
@@ -1378,6 +1518,9 @@
       <w:pPr>
         <w:pStyle w:val="af"/>
         <w:ind w:firstLine="360"/>
+        <w:rPr>
+          <w:lang w:val="ru-RU"/>
+        </w:rPr>
       </w:pPr>
       <w:r>
         <w:rPr>
@@ -1386,6 +1529,9 @@
         <w:t>select</w:t>
       </w:r>
       <w:r>
+        <w:rPr>
+          <w:lang w:val="ru-RU"/>
+        </w:rPr>
         <w:t xml:space="preserve"> Н_ЛЮДИ.ИМЯ, Н_ВЕДОМОСТИ.ЧЛВК_ИД, Н_СЕССИЯ.УЧГОД </w:t>
       </w:r>
       <w:r>
@@ -1395,6 +1541,9 @@
         <w:t>from</w:t>
       </w:r>
       <w:r>
+        <w:rPr>
+          <w:lang w:val="ru-RU"/>
+        </w:rPr>
         <w:t xml:space="preserve"> Н_ЛЮДИ</w:t>
       </w:r>
     </w:p>
@@ -1402,14 +1551,33 @@
       <w:pPr>
         <w:pStyle w:val="af"/>
         <w:ind w:firstLine="360"/>
+        <w:rPr>
+          <w:lang w:val="ru-RU"/>
+        </w:rPr>
       </w:pPr>
       <w:r>
         <w:rPr>
           <w:color w:val="0000FF"/>
         </w:rPr>
-        <w:t>right join</w:t>
-      </w:r>
-      <w:r>
+        <w:t>right</w:t>
+      </w:r>
+      <w:r>
+        <w:rPr>
+          <w:color w:val="0000FF"/>
+          <w:lang w:val="ru-RU"/>
+        </w:rPr>
+        <w:t xml:space="preserve"> </w:t>
+      </w:r>
+      <w:r>
+        <w:rPr>
+          <w:color w:val="0000FF"/>
+        </w:rPr>
+        <w:t>join</w:t>
+      </w:r>
+      <w:r>
+        <w:rPr>
+          <w:lang w:val="ru-RU"/>
+        </w:rPr>
         <w:t xml:space="preserve"> Н_ВЕДОМОСТИ </w:t>
       </w:r>
       <w:r>
@@ -1419,6 +1587,9 @@
         <w:t>on</w:t>
       </w:r>
       <w:r>
+        <w:rPr>
+          <w:lang w:val="ru-RU"/>
+        </w:rPr>
         <w:t xml:space="preserve"> Н_ВЕДОМОСТИ.ЧЛВК_ИД = Н_ЛЮДИ.ИД</w:t>
       </w:r>
     </w:p>
@@ -1426,14 +1597,33 @@
       <w:pPr>
         <w:pStyle w:val="af"/>
         <w:ind w:firstLine="360"/>
+        <w:rPr>
+          <w:lang w:val="ru-RU"/>
+        </w:rPr>
       </w:pPr>
       <w:r>
         <w:rPr>
           <w:color w:val="0000FF"/>
         </w:rPr>
-        <w:t>right join</w:t>
-      </w:r>
-      <w:r>
+        <w:t>right</w:t>
+      </w:r>
+      <w:r>
+        <w:rPr>
+          <w:color w:val="0000FF"/>
+          <w:lang w:val="ru-RU"/>
+        </w:rPr>
+        <w:t xml:space="preserve"> </w:t>
+      </w:r>
+      <w:r>
+        <w:rPr>
+          <w:color w:val="0000FF"/>
+        </w:rPr>
+        <w:t>join</w:t>
+      </w:r>
+      <w:r>
+        <w:rPr>
+          <w:lang w:val="ru-RU"/>
+        </w:rPr>
         <w:t xml:space="preserve"> Н_СЕССИЯ </w:t>
       </w:r>
       <w:r>
@@ -1443,6 +1633,9 @@
         <w:t>on</w:t>
       </w:r>
       <w:r>
+        <w:rPr>
+          <w:lang w:val="ru-RU"/>
+        </w:rPr>
         <w:t xml:space="preserve"> Н_СЕССИЯ.ЧЛВК_ИД = Н_ЛЮДИ.ИД</w:t>
       </w:r>
     </w:p>
@@ -1538,6 +1731,9 @@
         </w:rPr>
       </w:pPr>
       <w:r>
+        <w:rPr>
+          <w:noProof/>
+        </w:rPr>
         <w:drawing>
           <wp:inline distT="0" distB="0" distL="0" distR="0" wp14:anchorId="4C9773F1" wp14:editId="6947B59F">
             <wp:extent cx="5115639" cy="3381847"/>
@@ -1614,12 +1810,14 @@
       <w:r>
         <w:t xml:space="preserve"> </w:t>
       </w:r>
+      <w:proofErr w:type="spellStart"/>
       <w:r>
         <w:rPr>
           <w:color w:val="795E26"/>
         </w:rPr>
         <w:t>sorted_data</w:t>
       </w:r>
+      <w:proofErr w:type="spellEnd"/>
       <w:r>
         <w:t xml:space="preserve"> </w:t>
       </w:r>
@@ -1636,18 +1834,20 @@
     <w:p>
       <w:pPr>
         <w:ind w:firstLine="708"/>
+      </w:pPr>
+      <w:r>
+        <w:t xml:space="preserve">Тип индекса </w:t>
+      </w:r>
+      <w:proofErr w:type="spellStart"/>
+      <w:r>
         <w:rPr>
           <w:lang w:val="en-US"/>
         </w:rPr>
-      </w:pPr>
-      <w:r>
-        <w:t xml:space="preserve">Тип индекса </w:t>
-      </w:r>
-      <w:r>
-        <w:rPr>
-          <w:lang w:val="en-US"/>
-        </w:rPr>
-        <w:t>btree.</w:t>
+        <w:t>btree</w:t>
+      </w:r>
+      <w:proofErr w:type="spellEnd"/>
+      <w:r>
+        <w:t>.</w:t>
       </w:r>
     </w:p>
     <w:p>
@@ -1663,6 +1863,10 @@
         <w:ind w:firstLine="708"/>
       </w:pPr>
       <w:r>
+        <w:rPr>
+          <w:noProof/>
+        </w:rPr>
+        <w:lastRenderedPageBreak/>
         <w:drawing>
           <wp:inline distT="0" distB="0" distL="0" distR="0" wp14:anchorId="075B75B0" wp14:editId="0B215558">
             <wp:extent cx="5940425" cy="1009650"/>
@@ -1726,12 +1930,14 @@
       <w:r>
         <w:t xml:space="preserve"> </w:t>
       </w:r>
+      <w:proofErr w:type="spellStart"/>
       <w:r>
         <w:rPr>
           <w:color w:val="795E26"/>
         </w:rPr>
         <w:t>sorted_data</w:t>
       </w:r>
+      <w:proofErr w:type="spellEnd"/>
       <w:r>
         <w:t xml:space="preserve"> </w:t>
       </w:r>
@@ -1748,9 +1954,27 @@
     <w:p>
       <w:pPr>
         <w:ind w:firstLine="708"/>
-      </w:pPr>
-      <w:r>
-        <w:t>см. п. 1</w:t>
+        <w:rPr>
+          <w:lang w:val="en-US"/>
+        </w:rPr>
+      </w:pPr>
+      <w:r>
+        <w:t>см</w:t>
+      </w:r>
+      <w:r>
+        <w:rPr>
+          <w:lang w:val="en-US"/>
+        </w:rPr>
+        <w:t xml:space="preserve">. </w:t>
+      </w:r>
+      <w:r>
+        <w:t>п</w:t>
+      </w:r>
+      <w:r>
+        <w:rPr>
+          <w:lang w:val="en-US"/>
+        </w:rPr>
+        <w:t>. 1</w:t>
       </w:r>
     </w:p>
     <w:p>
@@ -1776,12 +2000,14 @@
       <w:r>
         <w:t xml:space="preserve"> </w:t>
       </w:r>
+      <w:proofErr w:type="spellStart"/>
       <w:r>
         <w:rPr>
           <w:color w:val="795E26"/>
         </w:rPr>
         <w:t>sorted_year</w:t>
       </w:r>
+      <w:proofErr w:type="spellEnd"/>
       <w:r>
         <w:t xml:space="preserve"> </w:t>
       </w:r>
@@ -1838,10 +2064,7 @@
         <w:ind w:left="708"/>
       </w:pPr>
       <w:r>
-        <w:t>Ускорит выполнение, так как в таблице содержится много значени</w:t>
-      </w:r>
-      <w:r>
-        <w:t xml:space="preserve">й, </w:t>
+        <w:t xml:space="preserve">Ускорит выполнение, так как в таблице содержится много значений, </w:t>
       </w:r>
       <w:r>
         <w:t>и</w:t>
@@ -2032,6 +2255,11 @@
       </w:pPr>
     </w:p>
     <w:p>
+      <w:pPr>
+        <w:ind w:left="360"/>
+      </w:pPr>
+    </w:p>
+    <w:p>
       <w:r>
         <w:t>Запрос 2</w:t>
       </w:r>
@@ -2096,13 +2324,7 @@
         <w:ind w:left="360"/>
       </w:pPr>
       <w:r>
-        <w:t>Наиболее оптимальным будет второй план, так как сначала</w:t>
-      </w:r>
-      <w:r>
-        <w:t xml:space="preserve"> содержание таблиц будет сортироваться, а затем соединяться</w:t>
-      </w:r>
-      <w:r>
-        <w:t>.</w:t>
+        <w:t>Наиболее оптимальным будет второй план, так как сначала содержание таблиц будет сортироваться, а затем соединяться.</w:t>
       </w:r>
     </w:p>
     <w:p>
@@ -2206,6 +2428,7 @@
       </w:pPr>
       <w:r>
         <w:rPr>
+          <w:noProof/>
           <w:lang w:val="ru-RU"/>
         </w:rPr>
         <w:drawing>
@@ -2263,11 +2486,16 @@
         <w:t>Запрос 2</w:t>
       </w:r>
     </w:p>
+    <w:p/>
     <w:p>
       <w:pPr>
         <w:pStyle w:val="af"/>
       </w:pPr>
       <w:r>
+        <w:rPr>
+          <w:noProof/>
+        </w:rPr>
+        <w:lastRenderedPageBreak/>
         <w:drawing>
           <wp:inline distT="0" distB="0" distL="0" distR="0" wp14:anchorId="67F6AA30" wp14:editId="341F4875">
             <wp:extent cx="5940425" cy="1758315"/>
@@ -4081,6 +4309,7 @@
   <w:style w:type="character" w:default="1" w:styleId="a0">
     <w:name w:val="Default Paragraph Font"/>
     <w:uiPriority w:val="1"/>
+    <w:semiHidden/>
     <w:unhideWhenUsed/>
   </w:style>
   <w:style w:type="table" w:default="1" w:styleId="a1">

</xml_diff>